<commit_message>
Remove generator section from final report
</commit_message>
<xml_diff>
--- a/AKOS-ChatBot/porocilo.docx
+++ b/AKOS-ChatBot/porocilo.docx
@@ -272,96 +272,7 @@
         <w:pStyle w:val="Heading2"/>
       </w:pPr>
       <w:r>
-        <w:t>4) Kako sem generiral primere</w:t>
-      </w:r>
-    </w:p>
-    <w:p>
-      <w:r>
-        <w:t>Uporabil sem dva generatorja:</w:t>
-      </w:r>
-    </w:p>
-    <w:p>
-      <w:r>
-        <w:t xml:space="preserve">1. </w:t>
-      </w:r>
-      <w:hyperlink r:id="rId14">
-        <w:r>
-          <w:rPr>
-            <w:color w:val="0563C1"/>
-            <w:u w:val="single"/>
-          </w:rPr>
-          <w:t>backend/evaluation/generate_akos_gold_2000.py</w:t>
-        </w:r>
-      </w:hyperlink>
-    </w:p>
-    <w:p>
-      <w:pPr>
-        <w:pStyle w:val="ListBullet"/>
-      </w:pPr>
-      <w:r>
-        <w:t>iz seed dataseta (v1) naredi 2000 variant,</w:t>
-      </w:r>
-    </w:p>
-    <w:p>
-      <w:pPr>
-        <w:pStyle w:val="ListBullet"/>
-      </w:pPr>
-      <w:r>
-        <w:t>menja slog prompta: `standard`, `short`, `detailed`, `journalist`, `frustrated`, `no_diacritics`, `colloquial`, `formal`,</w:t>
-      </w:r>
-    </w:p>
-    <w:p>
-      <w:pPr>
-        <w:pStyle w:val="ListBullet"/>
-      </w:pPr>
-      <w:r>
-        <w:t>isto vsebino tako preverjam v različnih jezikovnih oblikah.</w:t>
-      </w:r>
-    </w:p>
-    <w:p>
-      <w:r>
-        <w:t xml:space="preserve">2. </w:t>
-      </w:r>
-      <w:hyperlink r:id="rId15">
-        <w:r>
-          <w:rPr>
-            <w:color w:val="0563C1"/>
-            <w:u w:val="single"/>
-          </w:rPr>
-          <w:t>backend/evaluation/generate_internal_proxy_40.py</w:t>
-        </w:r>
-      </w:hyperlink>
-    </w:p>
-    <w:p>
-      <w:pPr>
-        <w:pStyle w:val="ListBullet"/>
-      </w:pPr>
-      <w:r>
-        <w:t>ustvari 40 anonimiziranih “internih proxy” primerov,</w:t>
-      </w:r>
-    </w:p>
-    <w:p>
-      <w:pPr>
-        <w:pStyle w:val="ListBullet"/>
-      </w:pPr>
-      <w:r>
-        <w:t>kategorije: račun, gostovanje, pošta, signal, menjava operaterja, postopek,</w:t>
-      </w:r>
-    </w:p>
-    <w:p>
-      <w:pPr>
-        <w:pStyle w:val="ListBullet"/>
-      </w:pPr>
-      <w:r>
-        <w:t>vsak primer ima več slogov (npr. short/formal/frustrated).</w:t>
-      </w:r>
-    </w:p>
-    <w:p>
-      <w:pPr>
-        <w:pStyle w:val="Heading3"/>
-      </w:pPr>
-      <w:r>
-        <w:t>4.1 Viri primerov (od kod so)</w:t>
+        <w:t>4) Viri primerov (od kod so)</w:t>
       </w:r>
     </w:p>
     <w:p>
@@ -373,7 +284,7 @@
       <w:pPr>
         <w:pStyle w:val="ListBullet"/>
       </w:pPr>
-      <w:hyperlink r:id="rId16">
+      <w:hyperlink r:id="rId14">
         <w:r>
           <w:rPr>
             <w:color w:val="0563C1"/>
@@ -387,7 +298,7 @@
       <w:pPr>
         <w:pStyle w:val="ListBullet"/>
       </w:pPr>
-      <w:hyperlink r:id="rId17">
+      <w:hyperlink r:id="rId15">
         <w:r>
           <w:rPr>
             <w:color w:val="0563C1"/>
@@ -401,7 +312,7 @@
       <w:pPr>
         <w:pStyle w:val="ListBullet"/>
       </w:pPr>
-      <w:hyperlink r:id="rId18">
+      <w:hyperlink r:id="rId16">
         <w:r>
           <w:rPr>
             <w:color w:val="0563C1"/>
@@ -415,7 +326,7 @@
       <w:pPr>
         <w:pStyle w:val="ListBullet"/>
       </w:pPr>
-      <w:hyperlink r:id="rId19">
+      <w:hyperlink r:id="rId17">
         <w:r>
           <w:rPr>
             <w:color w:val="0563C1"/>
@@ -429,7 +340,7 @@
       <w:pPr>
         <w:pStyle w:val="ListBullet"/>
       </w:pPr>
-      <w:hyperlink r:id="rId20">
+      <w:hyperlink r:id="rId18">
         <w:r>
           <w:rPr>
             <w:color w:val="0563C1"/>
@@ -443,7 +354,7 @@
       <w:pPr>
         <w:pStyle w:val="ListBullet"/>
       </w:pPr>
-      <w:hyperlink r:id="rId21">
+      <w:hyperlink r:id="rId19">
         <w:r>
           <w:rPr>
             <w:color w:val="0563C1"/>
@@ -457,7 +368,7 @@
       <w:pPr>
         <w:pStyle w:val="ListBullet"/>
       </w:pPr>
-      <w:hyperlink r:id="rId22">
+      <w:hyperlink r:id="rId20">
         <w:r>
           <w:rPr>
             <w:color w:val="0563C1"/>
@@ -471,7 +382,7 @@
       <w:pPr>
         <w:pStyle w:val="ListBullet"/>
       </w:pPr>
-      <w:hyperlink r:id="rId23">
+      <w:hyperlink r:id="rId21">
         <w:r>
           <w:rPr>
             <w:color w:val="0563C1"/>
@@ -485,7 +396,7 @@
       <w:pPr>
         <w:pStyle w:val="ListBullet"/>
       </w:pPr>
-      <w:hyperlink r:id="rId24">
+      <w:hyperlink r:id="rId22">
         <w:r>
           <w:rPr>
             <w:color w:val="0563C1"/>
@@ -1297,7 +1208,7 @@
       <w:r>
         <w:t xml:space="preserve">Vir: </w:t>
       </w:r>
-      <w:hyperlink r:id="rId25">
+      <w:hyperlink r:id="rId23">
         <w:r>
           <w:rPr>
             <w:color w:val="0563C1"/>

</xml_diff>

<commit_message>
Generiraj PDF in DOCX z popravljenim poročilom
</commit_message>
<xml_diff>
--- a/AKOS-ChatBot/porocilo.docx
+++ b/AKOS-ChatBot/porocilo.docx
@@ -10,6 +10,7 @@
         <w:t>Poročilo testiranja LLM modelov za slovenščino (AKOS)</w:t>
       </w:r>
     </w:p>
+    <w:p/>
     <w:p>
       <w:r>
         <w:t>Datum: 2026-03-16</w:t>
@@ -17,18 +18,10 @@
     </w:p>
     <w:p>
       <w:r>
-        <w:t xml:space="preserve">GitHub repozitorij: </w:t>
+        <w:t>GitHub repozitorij: [https://github.com/Luka24/PUSAnalizaModelov](https://github.com/Luka24/PUSAnalizaModelov)</w:t>
       </w:r>
-      <w:hyperlink r:id="rId9">
-        <w:r>
-          <w:rPr>
-            <w:color w:val="0563C1"/>
-            <w:u w:val="single"/>
-          </w:rPr>
-          <w:t>https://github.com/Luka24/PUSAnalizaModelov</w:t>
-        </w:r>
-      </w:hyperlink>
     </w:p>
+    <w:p/>
     <w:p>
       <w:pPr>
         <w:pStyle w:val="Heading2"/>
@@ -37,11 +30,13 @@
         <w:t>1) Kaj je bil cilj</w:t>
       </w:r>
     </w:p>
+    <w:p/>
     <w:p>
       <w:r>
         <w:t>Cilj je bil izbrati model, ki dobro odgovarja v slovenščini za AKOS scenarije (računi, gostovanje, menjava operaterja, postopki pri AKOS, novinarska vprašanja) in hkrati ne halucinira.</w:t>
       </w:r>
     </w:p>
+    <w:p/>
     <w:p>
       <w:pPr>
         <w:pStyle w:val="Heading2"/>
@@ -50,11 +45,13 @@
         <w:t>2) Lokalno okolje: poskusil sem, ampak ni šlo</w:t>
       </w:r>
     </w:p>
+    <w:p/>
     <w:p>
       <w:r>
         <w:t>Lokalno sem modela `gemma2:9b` in `mistral-nemo:12b` (ter tudi `llama3.1:8b`) testiral prek Ollama, ampak na tem računalniku to ni bilo stabilno.</w:t>
       </w:r>
     </w:p>
+    <w:p/>
     <w:p>
       <w:r>
         <w:t>Kaj se je dogajalo:</w:t>
@@ -92,6 +89,8 @@
         <w:t>to je pokvarilo primerljivost rezultatov.</w:t>
       </w:r>
     </w:p>
+    <w:p/>
+    <w:p/>
     <w:p>
       <w:r>
         <w:t>Zato je moj zaključek:</w:t>
@@ -105,6 +104,8 @@
         <w:t>za `gemma2:9b` in `mistral-nemo:12b` je za relevanten test treba uporabiti **Sling/HPC** (močnejši GPU),</w:t>
       </w:r>
     </w:p>
+    <w:p/>
+    <w:p/>
     <w:p>
       <w:pPr>
         <w:pStyle w:val="Heading2"/>
@@ -113,11 +114,13 @@
         <w:t>3) Testiranje z Groq (podrobneje)</w:t>
       </w:r>
     </w:p>
+    <w:p/>
     <w:p>
       <w:r>
         <w:t>Ker lokalni testi za večje modele niso bili stabilni, sem primerjalni test izvedel prek Groq API.</w:t>
       </w:r>
     </w:p>
+    <w:p/>
     <w:p>
       <w:r>
         <w:t>Kako je teklo:</w:t>
@@ -136,19 +139,7 @@
         <w:pStyle w:val="ListBullet"/>
       </w:pPr>
       <w:r>
-        <w:t xml:space="preserve">uporabljena je OpenAI-kompatibilna pot </w:t>
-      </w:r>
-      <w:hyperlink r:id="rId10">
-        <w:r>
-          <w:rPr>
-            <w:color w:val="0563C1"/>
-            <w:u w:val="single"/>
-          </w:rPr>
-          <w:t>https://api.groq.com/openai/v1/chat/completions</w:t>
-        </w:r>
-      </w:hyperlink>
-      <w:r>
-        <w:t>,</w:t>
+        <w:t>uporabljena je OpenAI-kompatibilna pot [https://api.groq.com/openai/v1/chat/completions](https://api.groq.com/openai/v1/chat/completions),</w:t>
       </w:r>
     </w:p>
     <w:p>
@@ -167,6 +158,7 @@
         <w:t>test je bil izveden na 120 primerih, stratified, seed 42.</w:t>
       </w:r>
     </w:p>
+    <w:p/>
     <w:p>
       <w:r>
         <w:t>Modeli v Groq 120-testu:</w:t>
@@ -220,6 +212,7 @@
         <w:t>`llama-3.3-70b-versatile`</w:t>
       </w:r>
     </w:p>
+    <w:p/>
     <w:p>
       <w:r>
         <w:t>Izhodi testa:</w:t>
@@ -229,44 +222,27 @@
       <w:pPr>
         <w:pStyle w:val="ListBullet"/>
       </w:pPr>
-      <w:hyperlink r:id="rId11">
-        <w:r>
-          <w:rPr>
-            <w:color w:val="0563C1"/>
-            <w:u w:val="single"/>
-          </w:rPr>
-          <w:t>results/groq_requested_6models_120cases_summary.csv</w:t>
-        </w:r>
-      </w:hyperlink>
+      <w:r>
+        <w:t>[results/groq_requested_6models_120cases_summary.csv](https://github.com/Luka24/PUSAnalizaModelov/blob/main/results/groq_requested_6models_120cases_summary.csv)</w:t>
+      </w:r>
     </w:p>
     <w:p>
       <w:pPr>
         <w:pStyle w:val="ListBullet"/>
       </w:pPr>
-      <w:hyperlink r:id="rId12">
-        <w:r>
-          <w:rPr>
-            <w:color w:val="0563C1"/>
-            <w:u w:val="single"/>
-          </w:rPr>
-          <w:t>results/groq_requested_6models_120cases_cases.csv</w:t>
-        </w:r>
-      </w:hyperlink>
+      <w:r>
+        <w:t>[results/groq_requested_6models_120cases_cases.csv](https://github.com/Luka24/PUSAnalizaModelov/blob/main/results/groq_requested_6models_120cases_cases.csv)</w:t>
+      </w:r>
     </w:p>
     <w:p>
       <w:pPr>
         <w:pStyle w:val="ListBullet"/>
       </w:pPr>
-      <w:hyperlink r:id="rId13">
-        <w:r>
-          <w:rPr>
-            <w:color w:val="0563C1"/>
-            <w:u w:val="single"/>
-          </w:rPr>
-          <w:t>results/sl_benchmark_20260316_222339.md</w:t>
-        </w:r>
-      </w:hyperlink>
+      <w:r>
+        <w:t>[results/sl_benchmark_20260316_222339.md](https://github.com/Luka24/PUSAnalizaModelov/blob/main/results/sl_benchmark_20260316_222339.md)</w:t>
+      </w:r>
     </w:p>
+    <w:p/>
     <w:p>
       <w:pPr>
         <w:pStyle w:val="Heading2"/>
@@ -275,142 +251,92 @@
         <w:t>4) Viri primerov (od kod so)</w:t>
       </w:r>
     </w:p>
+    <w:p/>
     <w:p>
       <w:r>
         <w:t>Primeri so pripravljeni iz javno dostopnih AKOS vsebin. Glavni viri so:</w:t>
+      </w:r>
+    </w:p>
+    <w:p/>
+    <w:p>
+      <w:pPr>
+        <w:pStyle w:val="ListBullet"/>
+      </w:pPr>
+      <w:r>
+        <w:t>[https://www.akos-rs.si/pogosta-vprasanja-in-odgovori](https://www.akos-rs.si/pogosta-vprasanja-in-odgovori)</w:t>
       </w:r>
     </w:p>
     <w:p>
       <w:pPr>
         <w:pStyle w:val="ListBullet"/>
       </w:pPr>
-      <w:hyperlink r:id="rId14">
-        <w:r>
-          <w:rPr>
-            <w:color w:val="0563C1"/>
-            <w:u w:val="single"/>
-          </w:rPr>
-          <w:t>https://www.akos-rs.si/pogosta-vprasanja-in-odgovori</w:t>
-        </w:r>
-      </w:hyperlink>
+      <w:r>
+        <w:t>[https://www.akos-rs.si/pogosta-vprasanja-in-odgovori/postopek-pred-akos](https://www.akos-rs.si/pogosta-vprasanja-in-odgovori/postopek-pred-akos)</w:t>
+      </w:r>
     </w:p>
     <w:p>
       <w:pPr>
         <w:pStyle w:val="ListBullet"/>
       </w:pPr>
-      <w:hyperlink r:id="rId15">
-        <w:r>
-          <w:rPr>
-            <w:color w:val="0563C1"/>
-            <w:u w:val="single"/>
-          </w:rPr>
-          <w:t>https://www.akos-rs.si/pogosta-vprasanja-in-odgovori/postopek-pred-akos</w:t>
-        </w:r>
-      </w:hyperlink>
+      <w:r>
+        <w:t>[https://www.akos-rs.si/pogosta-vprasanja-in-odgovori/o-gostovanju](https://www.akos-rs.si/pogosta-vprasanja-in-odgovori/o-gostovanju)</w:t>
+      </w:r>
     </w:p>
     <w:p>
       <w:pPr>
         <w:pStyle w:val="ListBullet"/>
       </w:pPr>
-      <w:hyperlink r:id="rId16">
-        <w:r>
-          <w:rPr>
-            <w:color w:val="0563C1"/>
-            <w:u w:val="single"/>
-          </w:rPr>
-          <w:t>https://www.akos-rs.si/pogosta-vprasanja-in-odgovori/o-gostovanju</w:t>
-        </w:r>
-      </w:hyperlink>
+      <w:r>
+        <w:t>[https://www.akos-rs.si/pogosta-vprasanja-in-odgovori/storitev-ne-deluje-ali-ni-ustrezna](https://www.akos-rs.si/pogosta-vprasanja-in-odgovori/storitev-ne-deluje-ali-ni-ustrezna)</w:t>
+      </w:r>
     </w:p>
     <w:p>
       <w:pPr>
         <w:pStyle w:val="ListBullet"/>
       </w:pPr>
-      <w:hyperlink r:id="rId17">
-        <w:r>
-          <w:rPr>
-            <w:color w:val="0563C1"/>
-            <w:u w:val="single"/>
-          </w:rPr>
-          <w:t>https://www.akos-rs.si/pogosta-vprasanja-in-odgovori/storitev-ne-deluje-ali-ni-ustrezna</w:t>
-        </w:r>
-      </w:hyperlink>
+      <w:r>
+        <w:t>[https://www.akos-rs.si/pogosta-vprasanja-in-odgovori/o-menjavi-operaterja-ali-spremembi-paketa](https://www.akos-rs.si/pogosta-vprasanja-in-odgovori/o-menjavi-operaterja-ali-spremembi-paketa)</w:t>
+      </w:r>
     </w:p>
     <w:p>
       <w:pPr>
         <w:pStyle w:val="ListBullet"/>
       </w:pPr>
-      <w:hyperlink r:id="rId18">
-        <w:r>
-          <w:rPr>
-            <w:color w:val="0563C1"/>
-            <w:u w:val="single"/>
-          </w:rPr>
-          <w:t>https://www.akos-rs.si/pogosta-vprasanja-in-odgovori/o-menjavi-operaterja-ali-spremembi-paketa</w:t>
-        </w:r>
-      </w:hyperlink>
+      <w:r>
+        <w:t>[https://www.akos-rs.si/pogosta-vprasanja-in-odgovori/neupravicen-racun](https://www.akos-rs.si/pogosta-vprasanja-in-odgovori/neupravicen-racun)</w:t>
+      </w:r>
     </w:p>
     <w:p>
       <w:pPr>
         <w:pStyle w:val="ListBullet"/>
       </w:pPr>
-      <w:hyperlink r:id="rId19">
-        <w:r>
-          <w:rPr>
-            <w:color w:val="0563C1"/>
-            <w:u w:val="single"/>
-          </w:rPr>
-          <w:t>https://www.akos-rs.si/pogosta-vprasanja-in-odgovori/neupravicen-racun</w:t>
-        </w:r>
-      </w:hyperlink>
+      <w:r>
+        <w:t>[https://www.akos-rs.si/uporabniki-storitev/raziscite/spori-med-operaterji-oz-izvajalci-postnih-storitev-in-koncnimi-uporabniki](https://www.akos-rs.si/uporabniki-storitev/raziscite/spori-med-operaterji-oz-izvajalci-postnih-storitev-in-koncnimi-uporabniki)</w:t>
+      </w:r>
     </w:p>
     <w:p>
       <w:pPr>
         <w:pStyle w:val="ListBullet"/>
       </w:pPr>
-      <w:hyperlink r:id="rId20">
-        <w:r>
-          <w:rPr>
-            <w:color w:val="0563C1"/>
-            <w:u w:val="single"/>
-          </w:rPr>
-          <w:t>https://www.akos-rs.si/uporabniki-storitev/raziscite/spori-med-operaterji-oz-izvajalci-postnih-storitev-in-koncnimi-uporabniki</w:t>
-        </w:r>
-      </w:hyperlink>
+      <w:r>
+        <w:t>[https://www.akos-rs.si/uporabniki-storitev/raziscite/koristni-nasveti-in-opozorila](https://www.akos-rs.si/uporabniki-storitev/raziscite/koristni-nasveti-in-opozorila)</w:t>
+      </w:r>
     </w:p>
     <w:p>
       <w:pPr>
         <w:pStyle w:val="ListBullet"/>
       </w:pPr>
-      <w:hyperlink r:id="rId21">
-        <w:r>
-          <w:rPr>
-            <w:color w:val="0563C1"/>
-            <w:u w:val="single"/>
-          </w:rPr>
-          <w:t>https://www.akos-rs.si/uporabniki-storitev/raziscite/koristni-nasveti-in-opozorila</w:t>
-        </w:r>
-      </w:hyperlink>
+      <w:r>
+        <w:t>[https://www.akos-rs.si/medijsko-sredisce/novinarska-vprasanja-in-odgovori](https://www.akos-rs.si/medijsko-sredisce/novinarska-vprasanja-in-odgovori)</w:t>
+      </w:r>
     </w:p>
-    <w:p>
-      <w:pPr>
-        <w:pStyle w:val="ListBullet"/>
-      </w:pPr>
-      <w:hyperlink r:id="rId22">
-        <w:r>
-          <w:rPr>
-            <w:color w:val="0563C1"/>
-            <w:u w:val="single"/>
-          </w:rPr>
-          <w:t>https://www.akos-rs.si/medijsko-sredisce/novinarska-vprasanja-in-odgovori</w:t>
-        </w:r>
-      </w:hyperlink>
-    </w:p>
+    <w:p/>
     <w:p>
       <w:r>
         <w:t>Zakaj se mi je to zdelo smiselno:</w:t>
       </w:r>
     </w:p>
+    <w:p/>
     <w:p>
       <w:pPr>
         <w:pStyle w:val="ListBullet"/>
@@ -443,6 +369,7 @@
         <w:t>ker se model tako ocenjuje na nalogah, ki so podobne dejanskim vprašanjem v praksi.</w:t>
       </w:r>
     </w:p>
+    <w:p/>
     <w:p>
       <w:r>
         <w:t>Nekaj konkretnih generiranih promptov:</w:t>
@@ -488,6 +415,7 @@
         <w:t>`INTP-004`: "[Stranka je nezadovoljna] ... Prosim za konkreten korak."</w:t>
       </w:r>
     </w:p>
+    <w:p/>
     <w:p>
       <w:pPr>
         <w:pStyle w:val="Heading2"/>
@@ -496,11 +424,13 @@
         <w:t>5) Kako se dodeli ocena</w:t>
       </w:r>
     </w:p>
+    <w:p/>
     <w:p>
       <w:r>
         <w:t>Vsak odgovor dobi 5 podocen (0–5):</w:t>
       </w:r>
     </w:p>
+    <w:p/>
     <w:p>
       <w:r>
         <w:t>1. `slovene_signal`</w:t>
@@ -514,6 +444,7 @@
         <w:t>preverja, ali je odgovor dejansko slovenski (šumniki + pogoste slovenske besede).</w:t>
       </w:r>
     </w:p>
+    <w:p/>
     <w:p>
       <w:r>
         <w:t>2. `required_coverage`</w:t>
@@ -527,6 +458,7 @@
         <w:t>ali odgovor pokrije ključne informacije (`required_keywords`).</w:t>
       </w:r>
     </w:p>
+    <w:p/>
     <w:p>
       <w:r>
         <w:t>3. `fluency`</w:t>
@@ -540,6 +472,7 @@
         <w:t>ali je odgovor berljiv in smiseln (stavki, dolžina, ponavljanje).</w:t>
       </w:r>
     </w:p>
+    <w:p/>
     <w:p>
       <w:r>
         <w:t>4. `abstention`</w:t>
@@ -553,6 +486,7 @@
         <w:t>pri primerih, kjer je pričakovana abstinenca (`expected_abstain=true`), model dobi točke samo, če ne ugiba in usmeri na uradne kanale.</w:t>
       </w:r>
     </w:p>
+    <w:p/>
     <w:p>
       <w:r>
         <w:t>5. `forbidden_control`</w:t>
@@ -566,16 +500,19 @@
         <w:t>kazen za prepovedane trditve (`forbidden_keywords`).</w:t>
       </w:r>
     </w:p>
+    <w:p/>
     <w:p>
       <w:r>
         <w:t>Končna ocena:</w:t>
       </w:r>
     </w:p>
+    <w:p/>
     <w:p>
       <w:r>
         <w:t>`overall = 0.25*slovene_signal + 0.30*required_coverage + 0.20*fluency + 0.15*abstention + 0.10*forbidden_control`</w:t>
       </w:r>
     </w:p>
+    <w:p/>
     <w:p>
       <w:r>
         <w:t>Status modela:</w:t>
@@ -597,6 +534,7 @@
         <w:t>sicer `FAIL`</w:t>
       </w:r>
     </w:p>
+    <w:p/>
     <w:p>
       <w:pPr>
         <w:pStyle w:val="Heading2"/>
@@ -605,596 +543,12 @@
         <w:t>6) Rezultati 120-primernega testa</w:t>
       </w:r>
     </w:p>
-    <w:tbl>
-      <w:tblPr>
-        <w:tblStyle w:val="TableGrid"/>
-        <w:tblW w:type="auto" w:w="0"/>
-        <w:tblLook w:firstColumn="1" w:firstRow="1" w:lastColumn="0" w:lastRow="0" w:noHBand="0" w:noVBand="1" w:val="04A0"/>
-      </w:tblPr>
-      <w:tblGrid>
-        <w:gridCol w:w="1234"/>
-        <w:gridCol w:w="1234"/>
-        <w:gridCol w:w="1234"/>
-        <w:gridCol w:w="1234"/>
-        <w:gridCol w:w="1234"/>
-        <w:gridCol w:w="1234"/>
-        <w:gridCol w:w="1234"/>
-      </w:tblGrid>
-      <w:tr>
-        <w:tc>
-          <w:tcPr>
-            <w:tcW w:type="dxa" w:w="1234"/>
-          </w:tcPr>
-          <w:p>
-            <w:pPr>
-              <w:jc w:val="center"/>
-            </w:pPr>
-            <w:r/>
-            <w:r>
-              <w:t>Model</w:t>
-            </w:r>
-          </w:p>
-        </w:tc>
-        <w:tc>
-          <w:tcPr>
-            <w:tcW w:type="dxa" w:w="1234"/>
-          </w:tcPr>
-          <w:p>
-            <w:pPr>
-              <w:jc w:val="center"/>
-            </w:pPr>
-            <w:r/>
-            <w:r>
-              <w:t>Status</w:t>
-            </w:r>
-          </w:p>
-        </w:tc>
-        <w:tc>
-          <w:tcPr>
-            <w:tcW w:type="dxa" w:w="1234"/>
-          </w:tcPr>
-          <w:p>
-            <w:pPr>
-              <w:jc w:val="center"/>
-            </w:pPr>
-            <w:r/>
-            <w:r>
-              <w:t>Povpr. ocena</w:t>
-            </w:r>
-          </w:p>
-        </w:tc>
-        <w:tc>
-          <w:tcPr>
-            <w:tcW w:type="dxa" w:w="1234"/>
-          </w:tcPr>
-          <w:p>
-            <w:pPr>
-              <w:jc w:val="center"/>
-            </w:pPr>
-            <w:r/>
-            <w:r>
-              <w:t>Povpr. čas (s)</w:t>
-            </w:r>
-          </w:p>
-        </w:tc>
-        <w:tc>
-          <w:tcPr>
-            <w:tcW w:type="dxa" w:w="1234"/>
-          </w:tcPr>
-          <w:p>
-            <w:pPr>
-              <w:jc w:val="center"/>
-            </w:pPr>
-            <w:r/>
-            <w:r>
-              <w:t>Testi</w:t>
-            </w:r>
-          </w:p>
-        </w:tc>
-        <w:tc>
-          <w:tcPr>
-            <w:tcW w:type="dxa" w:w="1234"/>
-          </w:tcPr>
-          <w:p>
-            <w:pPr>
-              <w:jc w:val="center"/>
-            </w:pPr>
-            <w:r/>
-            <w:r>
-              <w:t>Kritične napake</w:t>
-            </w:r>
-          </w:p>
-        </w:tc>
-        <w:tc>
-          <w:tcPr>
-            <w:tcW w:type="dxa" w:w="1234"/>
-          </w:tcPr>
-          <w:p>
-            <w:pPr>
-              <w:jc w:val="center"/>
-            </w:pPr>
-            <w:r/>
-            <w:r>
-              <w:t>Hard-fail</w:t>
-            </w:r>
-          </w:p>
-        </w:tc>
-      </w:tr>
-      <w:tr>
-        <w:tc>
-          <w:tcPr>
-            <w:tcW w:type="dxa" w:w="1234"/>
-          </w:tcPr>
-          <w:p>
-            <w:r/>
-            <w:r>
-              <w:t>qwen/qwen3-32b</w:t>
-            </w:r>
-          </w:p>
-        </w:tc>
-        <w:tc>
-          <w:tcPr>
-            <w:tcW w:type="dxa" w:w="1234"/>
-          </w:tcPr>
-          <w:p>
-            <w:r/>
-            <w:r>
-              <w:t>PASS</w:t>
-            </w:r>
-          </w:p>
-        </w:tc>
-        <w:tc>
-          <w:tcPr>
-            <w:tcW w:type="dxa" w:w="1234"/>
-          </w:tcPr>
-          <w:p>
-            <w:r/>
-            <w:r>
-              <w:t>3.9153</w:t>
-            </w:r>
-          </w:p>
-        </w:tc>
-        <w:tc>
-          <w:tcPr>
-            <w:tcW w:type="dxa" w:w="1234"/>
-          </w:tcPr>
-          <w:p>
-            <w:r/>
-            <w:r>
-              <w:t>2.7436</w:t>
-            </w:r>
-          </w:p>
-        </w:tc>
-        <w:tc>
-          <w:tcPr>
-            <w:tcW w:type="dxa" w:w="1234"/>
-          </w:tcPr>
-          <w:p>
-            <w:r/>
-            <w:r>
-              <w:t>120</w:t>
-            </w:r>
-          </w:p>
-        </w:tc>
-        <w:tc>
-          <w:tcPr>
-            <w:tcW w:type="dxa" w:w="1234"/>
-          </w:tcPr>
-          <w:p>
-            <w:r/>
-            <w:r>
-              <w:t>0</w:t>
-            </w:r>
-          </w:p>
-        </w:tc>
-        <w:tc>
-          <w:tcPr>
-            <w:tcW w:type="dxa" w:w="1234"/>
-          </w:tcPr>
-          <w:p>
-            <w:r/>
-            <w:r>
-              <w:t>0</w:t>
-            </w:r>
-          </w:p>
-        </w:tc>
-      </w:tr>
-      <w:tr>
-        <w:tc>
-          <w:tcPr>
-            <w:tcW w:type="dxa" w:w="1234"/>
-          </w:tcPr>
-          <w:p>
-            <w:r/>
-            <w:r>
-              <w:t>openai/gpt-oss-20b</w:t>
-            </w:r>
-          </w:p>
-        </w:tc>
-        <w:tc>
-          <w:tcPr>
-            <w:tcW w:type="dxa" w:w="1234"/>
-          </w:tcPr>
-          <w:p>
-            <w:r/>
-            <w:r>
-              <w:t>FAIL</w:t>
-            </w:r>
-          </w:p>
-        </w:tc>
-        <w:tc>
-          <w:tcPr>
-            <w:tcW w:type="dxa" w:w="1234"/>
-          </w:tcPr>
-          <w:p>
-            <w:r/>
-            <w:r>
-              <w:t>3.7632</w:t>
-            </w:r>
-          </w:p>
-        </w:tc>
-        <w:tc>
-          <w:tcPr>
-            <w:tcW w:type="dxa" w:w="1234"/>
-          </w:tcPr>
-          <w:p>
-            <w:r/>
-            <w:r>
-              <w:t>1.7102</w:t>
-            </w:r>
-          </w:p>
-        </w:tc>
-        <w:tc>
-          <w:tcPr>
-            <w:tcW w:type="dxa" w:w="1234"/>
-          </w:tcPr>
-          <w:p>
-            <w:r/>
-            <w:r>
-              <w:t>120</w:t>
-            </w:r>
-          </w:p>
-        </w:tc>
-        <w:tc>
-          <w:tcPr>
-            <w:tcW w:type="dxa" w:w="1234"/>
-          </w:tcPr>
-          <w:p>
-            <w:r/>
-            <w:r>
-              <w:t>4</w:t>
-            </w:r>
-          </w:p>
-        </w:tc>
-        <w:tc>
-          <w:tcPr>
-            <w:tcW w:type="dxa" w:w="1234"/>
-          </w:tcPr>
-          <w:p>
-            <w:r/>
-            <w:r>
-              <w:t>0</w:t>
-            </w:r>
-          </w:p>
-        </w:tc>
-      </w:tr>
-      <w:tr>
-        <w:tc>
-          <w:tcPr>
-            <w:tcW w:type="dxa" w:w="1234"/>
-          </w:tcPr>
-          <w:p>
-            <w:r/>
-            <w:r>
-              <w:t>openai/gpt-oss-safeguard-20b</w:t>
-            </w:r>
-          </w:p>
-        </w:tc>
-        <w:tc>
-          <w:tcPr>
-            <w:tcW w:type="dxa" w:w="1234"/>
-          </w:tcPr>
-          <w:p>
-            <w:r/>
-            <w:r>
-              <w:t>PASS</w:t>
-            </w:r>
-          </w:p>
-        </w:tc>
-        <w:tc>
-          <w:tcPr>
-            <w:tcW w:type="dxa" w:w="1234"/>
-          </w:tcPr>
-          <w:p>
-            <w:r/>
-            <w:r>
-              <w:t>3.9675</w:t>
-            </w:r>
-          </w:p>
-        </w:tc>
-        <w:tc>
-          <w:tcPr>
-            <w:tcW w:type="dxa" w:w="1234"/>
-          </w:tcPr>
-          <w:p>
-            <w:r/>
-            <w:r>
-              <w:t>2.0537</w:t>
-            </w:r>
-          </w:p>
-        </w:tc>
-        <w:tc>
-          <w:tcPr>
-            <w:tcW w:type="dxa" w:w="1234"/>
-          </w:tcPr>
-          <w:p>
-            <w:r/>
-            <w:r>
-              <w:t>120</w:t>
-            </w:r>
-          </w:p>
-        </w:tc>
-        <w:tc>
-          <w:tcPr>
-            <w:tcW w:type="dxa" w:w="1234"/>
-          </w:tcPr>
-          <w:p>
-            <w:r/>
-            <w:r>
-              <w:t>1</w:t>
-            </w:r>
-          </w:p>
-        </w:tc>
-        <w:tc>
-          <w:tcPr>
-            <w:tcW w:type="dxa" w:w="1234"/>
-          </w:tcPr>
-          <w:p>
-            <w:r/>
-            <w:r>
-              <w:t>0</w:t>
-            </w:r>
-          </w:p>
-        </w:tc>
-      </w:tr>
-      <w:tr>
-        <w:tc>
-          <w:tcPr>
-            <w:tcW w:type="dxa" w:w="1234"/>
-          </w:tcPr>
-          <w:p>
-            <w:r/>
-            <w:r>
-              <w:t>llama-3.1-8b-instant</w:t>
-            </w:r>
-          </w:p>
-        </w:tc>
-        <w:tc>
-          <w:tcPr>
-            <w:tcW w:type="dxa" w:w="1234"/>
-          </w:tcPr>
-          <w:p>
-            <w:r/>
-            <w:r>
-              <w:t>PASS</w:t>
-            </w:r>
-          </w:p>
-        </w:tc>
-        <w:tc>
-          <w:tcPr>
-            <w:tcW w:type="dxa" w:w="1234"/>
-          </w:tcPr>
-          <w:p>
-            <w:r/>
-            <w:r>
-              <w:t>3.9502</w:t>
-            </w:r>
-          </w:p>
-        </w:tc>
-        <w:tc>
-          <w:tcPr>
-            <w:tcW w:type="dxa" w:w="1234"/>
-          </w:tcPr>
-          <w:p>
-            <w:r/>
-            <w:r>
-              <w:t>1.2742</w:t>
-            </w:r>
-          </w:p>
-        </w:tc>
-        <w:tc>
-          <w:tcPr>
-            <w:tcW w:type="dxa" w:w="1234"/>
-          </w:tcPr>
-          <w:p>
-            <w:r/>
-            <w:r>
-              <w:t>120</w:t>
-            </w:r>
-          </w:p>
-        </w:tc>
-        <w:tc>
-          <w:tcPr>
-            <w:tcW w:type="dxa" w:w="1234"/>
-          </w:tcPr>
-          <w:p>
-            <w:r/>
-            <w:r>
-              <w:t>0</w:t>
-            </w:r>
-          </w:p>
-        </w:tc>
-        <w:tc>
-          <w:tcPr>
-            <w:tcW w:type="dxa" w:w="1234"/>
-          </w:tcPr>
-          <w:p>
-            <w:r/>
-            <w:r>
-              <w:t>0</w:t>
-            </w:r>
-          </w:p>
-        </w:tc>
-      </w:tr>
-      <w:tr>
-        <w:tc>
-          <w:tcPr>
-            <w:tcW w:type="dxa" w:w="1234"/>
-          </w:tcPr>
-          <w:p>
-            <w:r/>
-            <w:r>
-              <w:t>meta-llama/llama-4-scout-17b-16e-instruct</w:t>
-            </w:r>
-          </w:p>
-        </w:tc>
-        <w:tc>
-          <w:tcPr>
-            <w:tcW w:type="dxa" w:w="1234"/>
-          </w:tcPr>
-          <w:p>
-            <w:r/>
-            <w:r>
-              <w:t>PASS</w:t>
-            </w:r>
-          </w:p>
-        </w:tc>
-        <w:tc>
-          <w:tcPr>
-            <w:tcW w:type="dxa" w:w="1234"/>
-          </w:tcPr>
-          <w:p>
-            <w:r/>
-            <w:r>
-              <w:t>3.9731</w:t>
-            </w:r>
-          </w:p>
-        </w:tc>
-        <w:tc>
-          <w:tcPr>
-            <w:tcW w:type="dxa" w:w="1234"/>
-          </w:tcPr>
-          <w:p>
-            <w:r/>
-            <w:r>
-              <w:t>1.3968</w:t>
-            </w:r>
-          </w:p>
-        </w:tc>
-        <w:tc>
-          <w:tcPr>
-            <w:tcW w:type="dxa" w:w="1234"/>
-          </w:tcPr>
-          <w:p>
-            <w:r/>
-            <w:r>
-              <w:t>120</w:t>
-            </w:r>
-          </w:p>
-        </w:tc>
-        <w:tc>
-          <w:tcPr>
-            <w:tcW w:type="dxa" w:w="1234"/>
-          </w:tcPr>
-          <w:p>
-            <w:r/>
-            <w:r>
-              <w:t>1</w:t>
-            </w:r>
-          </w:p>
-        </w:tc>
-        <w:tc>
-          <w:tcPr>
-            <w:tcW w:type="dxa" w:w="1234"/>
-          </w:tcPr>
-          <w:p>
-            <w:r/>
-            <w:r>
-              <w:t>0</w:t>
-            </w:r>
-          </w:p>
-        </w:tc>
-      </w:tr>
-      <w:tr>
-        <w:tc>
-          <w:tcPr>
-            <w:tcW w:type="dxa" w:w="1234"/>
-          </w:tcPr>
-          <w:p>
-            <w:r/>
-            <w:r>
-              <w:t>llama-3.3-70b-versatile</w:t>
-            </w:r>
-          </w:p>
-        </w:tc>
-        <w:tc>
-          <w:tcPr>
-            <w:tcW w:type="dxa" w:w="1234"/>
-          </w:tcPr>
-          <w:p>
-            <w:r/>
-            <w:r>
-              <w:t>PASS</w:t>
-            </w:r>
-          </w:p>
-        </w:tc>
-        <w:tc>
-          <w:tcPr>
-            <w:tcW w:type="dxa" w:w="1234"/>
-          </w:tcPr>
-          <w:p>
-            <w:r/>
-            <w:r>
-              <w:t>3.9946</w:t>
-            </w:r>
-          </w:p>
-        </w:tc>
-        <w:tc>
-          <w:tcPr>
-            <w:tcW w:type="dxa" w:w="1234"/>
-          </w:tcPr>
-          <w:p>
-            <w:r/>
-            <w:r>
-              <w:t>1.7757</w:t>
-            </w:r>
-          </w:p>
-        </w:tc>
-        <w:tc>
-          <w:tcPr>
-            <w:tcW w:type="dxa" w:w="1234"/>
-          </w:tcPr>
-          <w:p>
-            <w:r/>
-            <w:r>
-              <w:t>120</w:t>
-            </w:r>
-          </w:p>
-        </w:tc>
-        <w:tc>
-          <w:tcPr>
-            <w:tcW w:type="dxa" w:w="1234"/>
-          </w:tcPr>
-          <w:p>
-            <w:r/>
-            <w:r>
-              <w:t>0</w:t>
-            </w:r>
-          </w:p>
-        </w:tc>
-        <w:tc>
-          <w:tcPr>
-            <w:tcW w:type="dxa" w:w="1234"/>
-          </w:tcPr>
-          <w:p>
-            <w:r/>
-            <w:r>
-              <w:t>0</w:t>
-            </w:r>
-          </w:p>
-        </w:tc>
-      </w:tr>
-    </w:tbl>
+    <w:p/>
+    <w:p>
+      <w:r>
+        <w:t>|---|---:|---:|---:|---:|---:|---:|</w:t>
+      </w:r>
+    </w:p>
     <w:p/>
     <w:p>
       <w:pPr>
@@ -1204,28 +558,19 @@
         <w:t>7) Konkretni izpisi odgovorov modelov (slabši + boljši primer za vsak model)</w:t>
       </w:r>
     </w:p>
+    <w:p/>
     <w:p>
       <w:r>
-        <w:t xml:space="preserve">Vir: </w:t>
-      </w:r>
-      <w:hyperlink r:id="rId23">
-        <w:r>
-          <w:rPr>
-            <w:color w:val="0563C1"/>
-            <w:u w:val="single"/>
-          </w:rPr>
-          <w:t>results/groq_requested_6models_120cases_examples.json</w:t>
-        </w:r>
-      </w:hyperlink>
-      <w:r>
-        <w:t>.</w:t>
+        <w:t>Vir: [results/groq_requested_6models_120cases_examples.json](https://github.com/Luka24/PUSAnalizaModelov/blob/main/results/groq_requested_6models_120cases_examples.json).</w:t>
       </w:r>
     </w:p>
+    <w:p/>
     <w:p>
       <w:r>
         <w:t>Vsi spodnji primeri so bili testirani na promptih, ki so bili pripravljeni iz zgornjih AKOS virov (FAQ, postopki, uporabniške pravice, medijska pojasnila).</w:t>
       </w:r>
     </w:p>
+    <w:p/>
     <w:p>
       <w:pPr>
         <w:pStyle w:val="Heading3"/>
@@ -1234,6 +579,7 @@
         <w:t>7.1 qwen/qwen3-32b</w:t>
       </w:r>
     </w:p>
+    <w:p/>
     <w:p>
       <w:r>
         <w:t>Slabši (`GOLD2-0725`, 3.04):</w:t>
@@ -1256,21 +602,16 @@
       </w:r>
     </w:p>
     <w:p>
-      <w:pPr>
-        <w:pStyle w:val="ListBullet"/>
-      </w:pPr>
       <w:r>
-        <w:t>"&lt;think&gt; Okay, the user is complaining about waiting a long time ..."</w:t>
+        <w:t>- "&lt;think&gt; Okay, the user is complaining about waiting a long time ..."</w:t>
       </w:r>
     </w:p>
     <w:p>
-      <w:pPr>
-        <w:pStyle w:val="ListBullet"/>
-      </w:pPr>
       <w:r>
-        <w:t>nato dolg angleški razmislek + deloma nepreverjena usmeritev.</w:t>
+        <w:t>- nato dolg angleški razmislek + deloma nepreverjena usmeritev.</w:t>
       </w:r>
     </w:p>
+    <w:p/>
     <w:p>
       <w:r>
         <w:t>Boljši (`GOLD2-1646`, 5.00):</w:t>
@@ -1293,13 +634,11 @@
       </w:r>
     </w:p>
     <w:p>
-      <w:pPr>
-        <w:pStyle w:val="ListBullet"/>
-      </w:pPr>
       <w:r>
-        <w:t>"Predlog za rešitev spora mora vsebovati: osnovne podatke, opis spora, predlagano rešitev, dokumente, rok, podpis ..."</w:t>
+        <w:t>- "Predlog za rešitev spora mora vsebovati: osnovne podatke, opis spora, predlagano rešitev, dokumente, rok, podpis ..."</w:t>
       </w:r>
     </w:p>
+    <w:p/>
     <w:p>
       <w:pPr>
         <w:pStyle w:val="Heading3"/>
@@ -1308,6 +647,7 @@
         <w:t>7.2 openai/gpt-oss-20b</w:t>
       </w:r>
     </w:p>
+    <w:p/>
     <w:p>
       <w:r>
         <w:t>Slabši (`GOLD2-0052`, 1.25):</w:t>
@@ -1330,13 +670,11 @@
       </w:r>
     </w:p>
     <w:p>
-      <w:pPr>
-        <w:pStyle w:val="ListBullet"/>
-      </w:pPr>
       <w:r>
-        <w:t>prazen string (`""`).</w:t>
+        <w:t>- prazen string (`""`).</w:t>
       </w:r>
     </w:p>
+    <w:p/>
     <w:p>
       <w:r>
         <w:t>Boljši (`GOLD2-1646`, 5.00):</w:t>
@@ -1351,13 +689,11 @@
       </w:r>
     </w:p>
     <w:p>
-      <w:pPr>
-        <w:pStyle w:val="ListBullet"/>
-      </w:pPr>
       <w:r>
-        <w:t>"Predlog za rešitev spora mora vsebovati: identifikacija strank, opis spora, pravna podlaga, zahteva po izidu, priloženi dokazi, podpis in datum."</w:t>
+        <w:t>- "Predlog za rešitev spora mora vsebovati: identifikacija strank, opis spora, pravna podlaga, zahteva po izidu, priloženi dokazi, podpis in datum."</w:t>
       </w:r>
     </w:p>
+    <w:p/>
     <w:p>
       <w:pPr>
         <w:pStyle w:val="Heading3"/>
@@ -1366,6 +702,7 @@
         <w:t>7.3 openai/gpt-oss-safeguard-20b</w:t>
       </w:r>
     </w:p>
+    <w:p/>
     <w:p>
       <w:r>
         <w:t>Slabši (`GOLD2-0672`, 1.25):</w:t>
@@ -1388,13 +725,11 @@
       </w:r>
     </w:p>
     <w:p>
-      <w:pPr>
-        <w:pStyle w:val="ListBullet"/>
-      </w:pPr>
       <w:r>
-        <w:t>prazen string (`""`).</w:t>
+        <w:t>- prazen string (`""`).</w:t>
       </w:r>
     </w:p>
+    <w:p/>
     <w:p>
       <w:r>
         <w:t>Boljši (`GOLD2-1646`, 5.00):</w:t>
@@ -1409,13 +744,11 @@
       </w:r>
     </w:p>
     <w:p>
-      <w:pPr>
-        <w:pStyle w:val="ListBullet"/>
-      </w:pPr>
       <w:r>
-        <w:t>"Kaj mora vsebovati popoln predlog ... Identifikacija strank, opis spora, zakonska podlaga, zahtevek, dokazila, podpis in datum ..."</w:t>
+        <w:t>- "Kaj mora vsebovati popoln predlog ... Identifikacija strank, opis spora, zakonska podlaga, zahtevek, dokazila, podpis in datum ..."</w:t>
       </w:r>
     </w:p>
+    <w:p/>
     <w:p>
       <w:pPr>
         <w:pStyle w:val="Heading3"/>
@@ -1424,6 +757,7 @@
         <w:t>7.4 llama-3.1-8b-instant</w:t>
       </w:r>
     </w:p>
+    <w:p/>
     <w:p>
       <w:r>
         <w:t>Slabši (`GOLD2-1479`, 2.75):</w:t>
@@ -1446,13 +780,11 @@
       </w:r>
     </w:p>
     <w:p>
-      <w:pPr>
-        <w:pStyle w:val="ListBullet"/>
-      </w:pPr>
       <w:r>
-        <w:t>"Prosim za podrobnosti. Kateri operater uporabljate ..."</w:t>
+        <w:t>- "Prosim za podrobnosti. Kateri operater uporabljate ..."</w:t>
       </w:r>
     </w:p>
+    <w:p/>
     <w:p>
       <w:r>
         <w:t>Boljši (`GOLD2-1679`, 4.99):</w:t>
@@ -1475,13 +807,11 @@
       </w:r>
     </w:p>
     <w:p>
-      <w:pPr>
-        <w:pStyle w:val="ListBullet"/>
-      </w:pPr>
       <w:r>
-        <w:t>"V postopku pred AKOS se roki tečejo po naslednjih korakih: 1. Prijava ... 2. Preverjanje ..."</w:t>
+        <w:t>- "V postopku pred AKOS se roki tečejo po naslednjih korakih: 1. Prijava ... 2. Preverjanje ..."</w:t>
       </w:r>
     </w:p>
+    <w:p/>
     <w:p>
       <w:pPr>
         <w:pStyle w:val="Heading3"/>
@@ -1490,6 +820,7 @@
         <w:t>7.5 meta-llama/llama-4-scout-17b-16e-instruct</w:t>
       </w:r>
     </w:p>
+    <w:p/>
     <w:p>
       <w:r>
         <w:t>Slabši (`GOLD2-0616`, 0.00):</w:t>
@@ -1504,13 +835,11 @@
       </w:r>
     </w:p>
     <w:p>
-      <w:pPr>
-        <w:pStyle w:val="ListBullet"/>
-      </w:pPr>
       <w:r>
-        <w:t>"NAPAKA: HTTPSConnectionPool(host='api.groq.com', port=443): Read timed out. (read timeout=120)"</w:t>
+        <w:t>- "NAPAKA: HTTPSConnectionPool(host='api.groq.com', port=443): Read timed out. (read timeout=120)"</w:t>
       </w:r>
     </w:p>
+    <w:p/>
     <w:p>
       <w:r>
         <w:t>Boljši (`GOLD2-0665`, 5.00):</w:t>
@@ -1525,13 +854,11 @@
       </w:r>
     </w:p>
     <w:p>
-      <w:pPr>
-        <w:pStyle w:val="ListBullet"/>
-      </w:pPr>
       <w:r>
-        <w:t>"Med postopkom pri AKOS ni potrebno poravnati sporni račun ... lahko počakate na izid postopka ..."</w:t>
+        <w:t>- "Med postopkom pri AKOS ni potrebno poravnati sporni račun ... lahko počakate na izid postopka ..."</w:t>
       </w:r>
     </w:p>
+    <w:p/>
     <w:p>
       <w:pPr>
         <w:pStyle w:val="Heading3"/>
@@ -1540,6 +867,7 @@
         <w:t>7.6 llama-3.3-70b-versatile</w:t>
       </w:r>
     </w:p>
+    <w:p/>
     <w:p>
       <w:r>
         <w:t>Slabši (`GOLD2-0303`, 3.25):</w:t>
@@ -1562,21 +890,16 @@
       </w:r>
     </w:p>
     <w:p>
-      <w:pPr>
-        <w:pStyle w:val="ListBullet"/>
-      </w:pPr>
       <w:r>
-        <w:t>"... lahko kontaktiraš podporo ... lahko kontaktiraš AKOS ..."</w:t>
+        <w:t>- "... lahko kontaktiraš podporo ... lahko kontaktiraš AKOS ..."</w:t>
       </w:r>
     </w:p>
     <w:p>
-      <w:pPr>
-        <w:pStyle w:val="ListBullet"/>
-      </w:pPr>
       <w:r>
-        <w:t>smer je pravilna, ampak odgovor je precej splošen.</w:t>
+        <w:t>- smer je pravilna, ampak odgovor je precej splošen.</w:t>
       </w:r>
     </w:p>
+    <w:p/>
     <w:p>
       <w:r>
         <w:t>Boljši (`GOLD2-0665`, 5.00):</w:t>
@@ -1591,13 +914,11 @@
       </w:r>
     </w:p>
     <w:p>
-      <w:pPr>
-        <w:pStyle w:val="ListBullet"/>
-      </w:pPr>
       <w:r>
-        <w:t>"Med postopkom pri AKOS ni potrebno takoj poravnati sporni račun ... čakajte na odločbo komisije ..."</w:t>
+        <w:t>- "Med postopkom pri AKOS ni potrebno takoj poravnati sporni račun ... čakajte na odločbo komisije ..."</w:t>
       </w:r>
     </w:p>
+    <w:p/>
     <w:p>
       <w:pPr>
         <w:pStyle w:val="Heading2"/>
@@ -1606,11 +927,13 @@
         <w:t>8) Primer konkretnega izračuna ocene</w:t>
       </w:r>
     </w:p>
+    <w:p/>
     <w:p>
       <w:r>
         <w:t>Primer: `openai/gpt-oss-20b`, `GOLD2-0052`</w:t>
       </w:r>
     </w:p>
+    <w:p/>
     <w:p>
       <w:pPr>
         <w:pStyle w:val="ListBullet"/>
@@ -1619,21 +942,25 @@
         <w:t>podocene: `slovene=0.0`, `coverage=0.0`, `fluency=0.0`, `abstention=5.0`, `forbidden=5.0`</w:t>
       </w:r>
     </w:p>
+    <w:p/>
     <w:p>
       <w:r>
         <w:t>Izračun:</w:t>
       </w:r>
     </w:p>
+    <w:p/>
     <w:p>
       <w:r>
         <w:t>`0.25*0 + 0.30*0 + 0.20*0 + 0.15*5 + 0.10*5 = 1.25`</w:t>
       </w:r>
     </w:p>
+    <w:p/>
     <w:p>
       <w:r>
         <w:t>Končna ocena = `1.25`.</w:t>
       </w:r>
     </w:p>
+    <w:p/>
     <w:p>
       <w:pPr>
         <w:pStyle w:val="Heading2"/>
@@ -1642,6 +969,7 @@
         <w:t>9) Odgovor na "Llama, Gemma, Mistral, GaMS"</w:t>
       </w:r>
     </w:p>
+    <w:p/>
     <w:p>
       <w:pPr>
         <w:pStyle w:val="ListBullet"/>
@@ -1674,6 +1002,7 @@
         <w:t>GaMS: ni razpoložljiv v trenutnem okolju</w:t>
       </w:r>
     </w:p>
+    <w:p/>
     <w:p>
       <w:pPr>
         <w:pStyle w:val="Heading2"/>
@@ -1682,32 +1011,81 @@
         <w:t>10) Končni zaključek</w:t>
       </w:r>
     </w:p>
+    <w:p/>
     <w:p>
       <w:r>
-        <w:t>Če je cilj model blizu 30B:</w:t>
+        <w:t>Razvrstitev modelov (po kakovosti in hitrosti):</w:t>
       </w:r>
     </w:p>
+    <w:p/>
     <w:p>
-      <w:pPr>
-        <w:pStyle w:val="ListBullet"/>
-      </w:pPr>
       <w:r>
-        <w:t>najboljši kandidat iz testa je `qwen/qwen3-32b`.</w:t>
+        <w:t>1. **Maksimalna kakovost (produkcija)**: `llama-3.3-70b-versatile`</w:t>
       </w:r>
     </w:p>
     <w:p>
       <w:r>
-        <w:t>Če je cilj maksimalna kakovost ne glede na velikost:</w:t>
+        <w:t>- Povprečna ocena: 3.9946</w:t>
       </w:r>
     </w:p>
     <w:p>
-      <w:pPr>
-        <w:pStyle w:val="ListBullet"/>
-      </w:pPr>
       <w:r>
-        <w:t>najboljši je `llama-3.3-70b-versatile`.</w:t>
+        <w:t>- Povprečni čas: 1.7757s</w:t>
       </w:r>
     </w:p>
+    <w:p>
+      <w:r>
+        <w:t>- Napake: 0</w:t>
+      </w:r>
+    </w:p>
+    <w:p/>
+    <w:p>
+      <w:r>
+        <w:t>2. **Najboljši kompromis (manjši model, hitrejši)**: `llama-3.1-8b-instant`</w:t>
+      </w:r>
+    </w:p>
+    <w:p>
+      <w:r>
+        <w:t>- Povprečna ocena: 3.9502 (boljši od Qwen 32B)</w:t>
+      </w:r>
+    </w:p>
+    <w:p>
+      <w:r>
+        <w:t>- Povprečni čas: 1.2742s (hitrejši od Qwen 32B)</w:t>
+      </w:r>
+    </w:p>
+    <w:p>
+      <w:r>
+        <w:t>- Napake: 0</w:t>
+      </w:r>
+    </w:p>
+    <w:p>
+      <w:r>
+        <w:t>- Lokalka alternativa prek Ollama (brez interneta)</w:t>
+      </w:r>
+    </w:p>
+    <w:p/>
+    <w:p>
+      <w:r>
+        <w:t>3. **Tretja izbira**: `llama-4-scout-17b-16e-instruct`</w:t>
+      </w:r>
+    </w:p>
+    <w:p>
+      <w:r>
+        <w:t>- Povprečna ocena: 3.9731</w:t>
+      </w:r>
+    </w:p>
+    <w:p>
+      <w:r>
+        <w:t>- Povprečni čas: 1.3968s</w:t>
+      </w:r>
+    </w:p>
+    <w:p>
+      <w:r>
+        <w:t>- Napake: 1</w:t>
+      </w:r>
+    </w:p>
+    <w:p/>
     <w:p>
       <w:r>
         <w:t>Za `gemma2:9b` in `mistral-nemo:12b` je moj predlog:</w:t>
@@ -1729,6 +1107,7 @@
         <w:t>potem se rezultate neposredno primerja s tem 120-primerim Groq benchmarkom.</w:t>
       </w:r>
     </w:p>
+    <w:p/>
     <w:sectPr>
       <w:pgSz w:w="12240" w:h="15840"/>
       <w:pgMar w:top="1440" w:right="1800" w:bottom="1440" w:left="1800" w:header="720" w:footer="720" w:gutter="0"/>

</xml_diff>